<commit_message>
Fix Azandog bossfight diacritics
</commit_message>
<xml_diff>
--- a/Essentials/Azandog_bossfight.docx
+++ b/Essentials/Azandog_bossfight.docx
@@ -1,5 +1,70 @@
 
-<file path=word/document.xml><?xml version="1.0" encoding="utf-8"?>
+<file path=customXml\item1.xml><?xml version="1.0" encoding="utf-8"?>
+<b:Sources xmlns:b="http://schemas.openxmlformats.org/officeDocument/2006/bibliography" xmlns="http://schemas.openxmlformats.org/officeDocument/2006/bibliography" SelectedStyle="/APA.XSL" StyleName="APA"/>
+</file>
+
+<file path=customXml\itemProps1.xml><?xml version="1.0" encoding="utf-8"?>
+<ds:datastoreItem xmlns:ds="http://schemas.openxmlformats.org/officeDocument/2006/customXml" ds:itemID="{EF278816-EC6F-A645-907D-7F25AECB1D4A}">
+  <ds:schemaRefs>
+    <ds:schemaRef ds:uri="http://schemas.openxmlformats.org/officeDocument/2006/bibliography"/>
+  </ds:schemaRefs>
+</ds:datastoreItem>
+</file>
+
+<file path=docProps\app.xml><?xml version="1.0" encoding="utf-8"?>
+<Properties xmlns="http://schemas.openxmlformats.org/officeDocument/2006/extended-properties" xmlns:vt="http://schemas.openxmlformats.org/officeDocument/2006/docPropsVTypes">
+  <Template>Normal.dotm</Template>
+  <TotalTime>0</TotalTime>
+  <Pages>1</Pages>
+  <Words>0</Words>
+  <Characters>0</Characters>
+  <Application>Microsoft Macintosh Word</Application>
+  <DocSecurity>0</DocSecurity>
+  <Lines>0</Lines>
+  <Paragraphs>0</Paragraphs>
+  <ScaleCrop>false</ScaleCrop>
+  <HeadingPairs>
+    <vt:vector size="2" baseType="variant">
+      <vt:variant>
+        <vt:lpstr>Title</vt:lpstr>
+      </vt:variant>
+      <vt:variant>
+        <vt:i4>1</vt:i4>
+      </vt:variant>
+    </vt:vector>
+  </HeadingPairs>
+  <TitlesOfParts>
+    <vt:vector size="1" baseType="lpstr">
+      <vt:lpstr/>
+    </vt:vector>
+  </TitlesOfParts>
+  <Manager/>
+  <Company/>
+  <LinksUpToDate>false</LinksUpToDate>
+  <CharactersWithSpaces>0</CharactersWithSpaces>
+  <SharedDoc>false</SharedDoc>
+  <HyperlinkBase/>
+  <HyperlinksChanged>false</HyperlinksChanged>
+  <AppVersion>14.0000</AppVersion>
+</Properties>
+</file>
+
+<file path=docProps\core.xml><?xml version="1.0" encoding="utf-8"?>
+<cp:coreProperties xmlns:cp="http://schemas.openxmlformats.org/package/2006/metadata/core-properties" xmlns:dc="http://purl.org/dc/elements/1.1/" xmlns:dcterms="http://purl.org/dc/terms/" xmlns:dcmitype="http://purl.org/dc/dcmitype/" xmlns:xsi="http://www.w3.org/2001/XMLSchema-instance">
+  <dc:title/>
+  <dc:subject/>
+  <dc:creator>python-docx</dc:creator>
+  <cp:keywords/>
+  <dc:description>generated by python-docx</dc:description>
+  <cp:lastModifiedBy/>
+  <cp:revision>1</cp:revision>
+  <dcterms:created xsi:type="dcterms:W3CDTF">2013-12-23T23:15:00Z</dcterms:created>
+  <dcterms:modified xsi:type="dcterms:W3CDTF">2013-12-23T23:15:00Z</dcterms:modified>
+  <cp:category/>
+</cp:coreProperties>
+</file>
+
+<file path=word\document.xml><?xml version="1.0" encoding="utf-8"?>
 <w:document xmlns:wpc="http://schemas.microsoft.com/office/word/2010/wordprocessingCanvas" xmlns:mo="http://schemas.microsoft.com/office/mac/office/2008/main" xmlns:mc="http://schemas.openxmlformats.org/markup-compatibility/2006" xmlns:mv="urn:schemas-microsoft-com:mac:vml" xmlns:o="urn:schemas-microsoft-com:office:office" xmlns:r="http://schemas.openxmlformats.org/officeDocument/2006/relationships" xmlns:m="http://schemas.openxmlformats.org/officeDocument/2006/math" xmlns:v="urn:schemas-microsoft-com:vml" xmlns:wp14="http://schemas.microsoft.com/office/word/2010/wordprocessingDrawing" xmlns:wp="http://schemas.openxmlformats.org/drawingml/2006/wordprocessingDrawing" xmlns:w10="urn:schemas-microsoft-com:office:word" xmlns:w="http://schemas.openxmlformats.org/wordprocessingml/2006/main" xmlns:w14="http://schemas.microsoft.com/office/word/2010/wordml" xmlns:wpg="http://schemas.microsoft.com/office/word/2010/wordprocessingGroup" xmlns:wpi="http://schemas.microsoft.com/office/word/2010/wordprocessingInk" xmlns:wne="http://schemas.microsoft.com/office/word/2006/wordml" xmlns:wps="http://schemas.microsoft.com/office/word/2010/wordprocessingShape" mc:Ignorable="w14 wp14">
   <w:body>
     <w:p>
@@ -36,7 +101,7 @@
           <w:color w:val="5C3114"/>
           <w:sz w:val="32"/>
         </w:rPr>
-        <w:t>Azandog, Nemrtv? or?? vl?dce</w:t>
+        <w:t>Azandog, Nemrtvý orčí vládce</w:t>
       </w:r>
     </w:p>
     <w:p>
@@ -54,7 +119,7 @@
           <w:color w:val="5C3114"/>
           <w:sz w:val="27"/>
         </w:rPr>
-        <w:t>F?ze 1 - Azandog p?ed bo?stv?m</w:t>
+        <w:t>Fáze 1 - Azandog před božstvím</w:t>
       </w:r>
     </w:p>
     <w:p>
@@ -395,7 +460,7 @@
           <w:color w:val="2D1F15"/>
           <w:sz w:val="23"/>
         </w:rPr>
-        <w:t>Kdy? Azandog klesne na 0 HP, nespust? se b??n? smrt. M?sto toho za?ne p?echod do druh? f?ze.</w:t>
+        <w:t>Když Azandog klesne na 0 HP, nespustí se běžná smrt. Místo toho začne přechod do druhé fáze.</w:t>
       </w:r>
     </w:p>
     <w:p>
@@ -413,7 +478,7 @@
           <w:color w:val="5C3114"/>
           <w:sz w:val="27"/>
         </w:rPr>
-        <w:t>Or?? vzdor</w:t>
+        <w:t>Orčí vzdor</w:t>
       </w:r>
     </w:p>
     <w:p>
@@ -428,7 +493,7 @@
           <w:color w:val="2D1F15"/>
           <w:sz w:val="23"/>
         </w:rPr>
-        <w:t>Kdy? Azandog dostane z?sah, kter? by ho shodil pod polovinu HP, m??e jako reakci za?vat a z?skat 10 temporary HP. Tuto schopnost m??e pou??t jednou za prvn? f?zi.</w:t>
+        <w:t>Když Azandog dostane zásah, který by ho shodil pod polovinu HP, může jako reakci zařvat a získat 10 temporary HP. Tuto schopnost může použít jednou za první fázi.</w:t>
       </w:r>
     </w:p>
     <w:p>
@@ -446,7 +511,7 @@
           <w:color w:val="5C3114"/>
           <w:sz w:val="27"/>
         </w:rPr>
-        <w:t>Z??? v??i ?iv?m</w:t>
+        <w:t>Zášť vůči živým</w:t>
       </w:r>
     </w:p>
     <w:p>
@@ -461,7 +526,7 @@
           <w:color w:val="2D1F15"/>
           <w:sz w:val="23"/>
         </w:rPr>
-        <w:t>Kdy? Azandog zas?hne bytost, kter? mu v minul?m kole zp?sobila zran?n?, zp?sob? nav?c 1d6 necrotic damage.</w:t>
+        <w:t>Když Azandog zasáhne bytost, která mu v minulém kole způsobila zranění, způsobí navíc 1d6 necrotic damage.</w:t>
       </w:r>
     </w:p>
     <w:p>
@@ -512,7 +577,7 @@
           <w:color w:val="2D1F15"/>
           <w:sz w:val="23"/>
         </w:rPr>
-        <w:t>Azandog provede dva ?toky tridentem.</w:t>
+        <w:t>Azandog provede dva útoky tridentem.</w:t>
       </w:r>
     </w:p>
     <w:p>
@@ -530,7 +595,7 @@
           <w:color w:val="5C3114"/>
           <w:sz w:val="27"/>
         </w:rPr>
-        <w:t>Azandog?v dvojzub? trident</w:t>
+        <w:t>Azandogův dvojzubý trident</w:t>
       </w:r>
     </w:p>
     <w:p>
@@ -598,7 +663,7 @@
           <w:color w:val="5C3114"/>
           <w:sz w:val="27"/>
         </w:rPr>
-        <w:t>Zah?knut? tridentem</w:t>
+        <w:t>Zaháknutí tridentem</w:t>
       </w:r>
     </w:p>
     <w:p>
@@ -613,7 +678,7 @@
           <w:color w:val="2D1F15"/>
           <w:sz w:val="23"/>
         </w:rPr>
-        <w:t>Po z?sahu tridentem mus? c?l usp?t na DC 14 Strength saving throw, jinak je p?ita?en a? o 10 ft. sm?rem k Azandogovi.</w:t>
+        <w:t>Po zásahu tridentem musí cíl uspět na DC 14 Strength saving throw, jinak je přitažen až o 10 ft. směrem k Azandogovi.</w:t>
       </w:r>
     </w:p>
     <w:p>
@@ -628,7 +693,7 @@
           <w:color w:val="2D1F15"/>
           <w:sz w:val="23"/>
         </w:rPr>
-        <w:t>Tuto schopnost pou?ij maxim?ln? jednou za kolo, aby to nebylo otravn?.</w:t>
+        <w:t>Tuto schopnost použij maximálně jednou za kolo, aby to nebylo otravné.</w:t>
       </w:r>
     </w:p>
     <w:p>
@@ -646,7 +711,7 @@
           <w:color w:val="5C3114"/>
           <w:sz w:val="27"/>
         </w:rPr>
-        <w:t>Hrobov? ?ev</w:t>
+        <w:t>Hrobový řev</w:t>
       </w:r>
     </w:p>
     <w:p>
@@ -686,7 +751,7 @@
           <w:color w:val="2D1F15"/>
           <w:sz w:val="23"/>
         </w:rPr>
-        <w:t>Azandog za?ve nen?vist? star?ch bitev. Ka?d? nep??telsk? bytost do 15 ft. mus? hodit DC 13 Wisdom saving throw.</w:t>
+        <w:t>Azandog zařve nenávistí starých bitev. Každá nepřátelská bytost do 15 ft. musí hodit DC 13 Wisdom saving throw.</w:t>
       </w:r>
     </w:p>
     <w:p>
@@ -701,7 +766,7 @@
           <w:color w:val="2D1F15"/>
           <w:sz w:val="23"/>
         </w:rPr>
-        <w:t>P?i ne?sp?chu je bytost frightened a? do konce sv?ho p???t?ho tahu. Pokud usp?je, je proti tomuto ?evu imunn? do konce prvn? f?ze.</w:t>
+        <w:t>Při neúspěchu je bytost frightened až do konce svého příštího tahu. Pokud uspěje, je proti tomuto řevu imunní do konce první fáze.</w:t>
       </w:r>
     </w:p>
     <w:p>
@@ -719,7 +784,7 @@
           <w:color w:val="5C3114"/>
           <w:sz w:val="32"/>
         </w:rPr>
-        <w:t>P?echod mezi f?zemi</w:t>
+        <w:t>Přechod mezi fázemi</w:t>
       </w:r>
     </w:p>
     <w:p>
@@ -734,7 +799,7 @@
           <w:color w:val="2D1F15"/>
           <w:sz w:val="23"/>
         </w:rPr>
-        <w:t>Kdy? Azandog v prvn? f?zi klesne na 0 HP:</w:t>
+        <w:t>Když Azandog v první fázi klesne na 0 HP:</w:t>
       </w:r>
     </w:p>
     <w:p>
@@ -749,7 +814,7 @@
           <w:color w:val="2D1F15"/>
           <w:sz w:val="23"/>
         </w:rPr>
-        <w:t>P?r vte?in se zd?, ?e pad?. Pak zabodne trident do zem?/olt??e. Jeho star? or?? kosti zapraskaj?, zbroj se roz?hav? temn? rud?m sv?tlem a m?stnost napln? hlasy t?ch, kte?? zem?eli s nen?vist? v srdci.</w:t>
+        <w:t>Pár vteřin se zdá, že padá. Pak zabodne trident do země/oltáře. Jeho staré orčí kosti zapraskají, zbroj se rozžhaví temně rudým světlem a místnost naplní hlasy těch, kteří zemřeli s nenávistí v srdci.</w:t>
       </w:r>
     </w:p>
     <w:p>
@@ -764,7 +829,7 @@
           <w:color w:val="2D1F15"/>
           <w:sz w:val="23"/>
         </w:rPr>
-        <w:t>V?ichni hr??i do 20 ft. od n?j mus? hodit DC 14 Constitution saving throw.</w:t>
+        <w:t>Všichni hráči do 20 ft. od něj musí hodit DC 14 Constitution saving throw.</w:t>
       </w:r>
     </w:p>
     <w:p>
@@ -781,7 +846,7 @@
           <w:color w:val="2D1F15"/>
           <w:sz w:val="23"/>
         </w:rPr>
-        <w:t>P?i ne?sp?chu dostanou 2d8 necrotic damage a jsou odhozeni o 10 ft.</w:t>
+        <w:t>Při neúspěchu dostanou 2d8 necrotic damage a jsou odhozeni o 10 ft.</w:t>
       </w:r>
     </w:p>
     <w:p>
@@ -798,7 +863,7 @@
           <w:color w:val="2D1F15"/>
           <w:sz w:val="23"/>
         </w:rPr>
-        <w:t>P?i ?sp?chu dostanou polovinu zran?n? a nejsou odhozeni.</w:t>
+        <w:t>Při úspěchu dostanou polovinu zranění a nejsou odhozeni.</w:t>
       </w:r>
     </w:p>
     <w:p>
@@ -813,7 +878,7 @@
           <w:color w:val="2D1F15"/>
           <w:sz w:val="23"/>
         </w:rPr>
-        <w:t>Pot? za??n? druh? f?ze. Azandog se zvedne jako Azandog, B?h hn?vu a z??t?.</w:t>
+        <w:t>Poté začíná druhá fáze. Azandog se zvedne jako Azandog, Bůh hněvu a zášti.</w:t>
       </w:r>
     </w:p>
     <w:p>
@@ -831,7 +896,7 @@
           <w:color w:val="5C3114"/>
           <w:sz w:val="32"/>
         </w:rPr>
-        <w:t>Azandog, B?h hn?vu a z??t?</w:t>
+        <w:t>Azandog, Bůh hněvu a zášti</w:t>
       </w:r>
     </w:p>
     <w:p>
@@ -849,7 +914,7 @@
           <w:color w:val="5C3114"/>
           <w:sz w:val="27"/>
         </w:rPr>
-        <w:t>F?ze 2 - Ni??? b?h hn?vu a z??t?</w:t>
+        <w:t>Fáze 2 - Nižší bůh hněvu a zášti</w:t>
       </w:r>
     </w:p>
     <w:p>
@@ -1139,7 +1204,7 @@
           <w:color w:val="2D1F15"/>
           <w:sz w:val="23"/>
         </w:rPr>
-        <w:t>cca CR 5-6, ale jako boss pro 5 hr??? level 4</w:t>
+        <w:t>cca CR 5-6, ale jako boss pro 5 hráčů level 4</w:t>
       </w:r>
     </w:p>
     <w:p>
@@ -1175,7 +1240,7 @@
           <w:color w:val="5C3114"/>
           <w:sz w:val="27"/>
         </w:rPr>
-        <w:t>Aura hn?vu</w:t>
+        <w:t>Aura hněvu</w:t>
       </w:r>
     </w:p>
     <w:p>
@@ -1190,7 +1255,7 @@
           <w:color w:val="2D1F15"/>
           <w:sz w:val="23"/>
         </w:rPr>
-        <w:t>Na za??tku Azandogova tahu utrp? ka?d? nep??telsk? bytost do 10 ft. od n?j 3 psychic damage, pokud Azandoga od za??tku sv?ho minul?ho tahu zranila.</w:t>
+        <w:t>Na začátku Azandogova tahu utrpí každá nepřátelská bytost do 10 ft. od něj 3 psychic damage, pokud Azandoga od začátku svého minulého tahu zranila.</w:t>
       </w:r>
     </w:p>
     <w:p>
@@ -1205,7 +1270,7 @@
           <w:color w:val="2D1F15"/>
           <w:sz w:val="23"/>
         </w:rPr>
-        <w:t>Tohle reprezentuje jeho z??? - ??m v?c ho n?kdo ?e?e, t?m v?c ho jeho nen?vist p?l? zp?tky.</w:t>
+        <w:t>Tohle reprezentuje jeho zášť - čím víc ho někdo řeže, tím víc ho jeho nenávist pálí zpátky.</w:t>
       </w:r>
     </w:p>
     <w:p>
@@ -1223,7 +1288,7 @@
           <w:color w:val="5C3114"/>
           <w:sz w:val="27"/>
         </w:rPr>
-        <w:t>Bo?sk? z???</w:t>
+        <w:t>Božská zášť</w:t>
       </w:r>
     </w:p>
     <w:p>
@@ -1238,7 +1303,7 @@
           <w:color w:val="2D1F15"/>
           <w:sz w:val="23"/>
         </w:rPr>
-        <w:t>Na za??tku ka?d?ho Azandogova tahu si Azandog vybere jednu bytost, kter? mu od jeho minul?ho tahu zp?sobila nejv?t?? zran?n?.</w:t>
+        <w:t>Na začátku každého Azandogova tahu si Azandog vybere jednu bytost, která mu od jeho minulého tahu způsobila největší zranění.</w:t>
       </w:r>
     </w:p>
     <w:p>
@@ -1253,7 +1318,7 @@
           <w:color w:val="2D1F15"/>
           <w:sz w:val="23"/>
         </w:rPr>
-        <w:t>Ta bytost se stane jeho c?lem z??ti a? do za??tku jeho dal??ho tahu.</w:t>
+        <w:t>Ta bytost se stane jeho cílem zášti až do začátku jeho dalšího tahu.</w:t>
       </w:r>
     </w:p>
     <w:p>
@@ -1268,7 +1333,7 @@
           <w:color w:val="2D1F15"/>
           <w:sz w:val="23"/>
         </w:rPr>
-        <w:t>Azandog m? proti c?li z??ti v?hodu na prvn? ?tok tridentem v tomto tahu.</w:t>
+        <w:t>Azandog má proti cíli zášti výhodu na první útok tridentem v tomto tahu.</w:t>
       </w:r>
     </w:p>
     <w:p>
@@ -1286,7 +1351,7 @@
           <w:color w:val="5C3114"/>
           <w:sz w:val="27"/>
         </w:rPr>
-        <w:t>Nezlomiteln? hn?v</w:t>
+        <w:t>Nezlomitelný hněv</w:t>
       </w:r>
     </w:p>
     <w:p>
@@ -1301,7 +1366,7 @@
           <w:color w:val="2D1F15"/>
           <w:sz w:val="23"/>
         </w:rPr>
-        <w:t>Kdy? Azandog poprv? ve druh? f?zi klesne pod 40 HP, okam?it? z?sk? 15 temporary HP a jeho dal?? z?sah tridentem zp?sob? nav?c 2d6 psychic damage.</w:t>
+        <w:t>Když Azandog poprvé ve druhé fázi klesne pod 40 HP, okamžitě získá 15 temporary HP a jeho další zásah tridentem způsobí navíc 2d6 psychic damage.</w:t>
       </w:r>
     </w:p>
     <w:p>
@@ -1352,7 +1417,7 @@
           <w:color w:val="2D1F15"/>
           <w:sz w:val="23"/>
         </w:rPr>
-        <w:t>Azandog provede dva ?toky bo?sk?m tridentem.</w:t>
+        <w:t>Azandog provede dva útoky božským tridentem.</w:t>
       </w:r>
     </w:p>
     <w:p>
@@ -1370,7 +1435,7 @@
           <w:color w:val="5C3114"/>
           <w:sz w:val="27"/>
         </w:rPr>
-        <w:t>Bo?sk? dvojzub? trident</w:t>
+        <w:t>Božský dvojzubý trident</w:t>
       </w:r>
     </w:p>
     <w:p>
@@ -1438,7 +1503,7 @@
           <w:color w:val="5C3114"/>
           <w:sz w:val="27"/>
         </w:rPr>
-        <w:t>Bodnut? z??t?</w:t>
+        <w:t>Bodnutí zášti</w:t>
       </w:r>
     </w:p>
     <w:p>
@@ -1453,7 +1518,7 @@
           <w:color w:val="2D1F15"/>
           <w:sz w:val="23"/>
         </w:rPr>
-        <w:t>Azandog za?to?? tridentem na sv?j c?l z??ti.</w:t>
+        <w:t>Azandog zaútočí tridentem na svůj cíl zášti.</w:t>
       </w:r>
     </w:p>
     <w:p>
@@ -1518,7 +1583,7 @@
           <w:color w:val="2D1F15"/>
           <w:sz w:val="23"/>
         </w:rPr>
-        <w:t>Tento ?tok pou?ij m?sto jednoho b??n?ho ?toku z Multiattacku.</w:t>
+        <w:t>Tento útok použij místo jednoho běžného útoku z Multiattacku.</w:t>
       </w:r>
     </w:p>
     <w:p>
@@ -1536,7 +1601,7 @@
           <w:color w:val="5C3114"/>
           <w:sz w:val="27"/>
         </w:rPr>
-        <w:t>Vlna hn?vu</w:t>
+        <w:t>Vlna hněvu</w:t>
       </w:r>
     </w:p>
     <w:p>
@@ -1576,7 +1641,7 @@
           <w:color w:val="2D1F15"/>
           <w:sz w:val="23"/>
         </w:rPr>
-        <w:t>Azandog ude?? tridentem do zem?. Ka?d? nep??telsk? bytost do 15 ft. mus? hodit DC 15 Dexterity saving throw.</w:t>
+        <w:t>Azandog udeří tridentem do země. Každá nepřátelská bytost do 15 ft. musí hodit DC 15 Dexterity saving throw.</w:t>
       </w:r>
     </w:p>
     <w:p>
@@ -1591,7 +1656,7 @@
           <w:color w:val="2D1F15"/>
           <w:sz w:val="23"/>
         </w:rPr>
-        <w:t>P?i ne?sp?chu utrp? 3d8 necrotic damage a je sra?ena prone.</w:t>
+        <w:t>Při neúspěchu utrpí 3d8 necrotic damage a je sražena prone.</w:t>
       </w:r>
     </w:p>
     <w:p>
@@ -1606,7 +1671,7 @@
           <w:color w:val="2D1F15"/>
           <w:sz w:val="23"/>
         </w:rPr>
-        <w:t>P?i ?sp?chu utrp? polovinu zran?n? a nen? sra?ena.</w:t>
+        <w:t>Při úspěchu utrpí polovinu zranění a není sražena.</w:t>
       </w:r>
     </w:p>
     <w:p>
@@ -1624,7 +1689,7 @@
           <w:color w:val="5C3114"/>
           <w:sz w:val="32"/>
         </w:rPr>
-        <w:t>Legendary Actions - pouze druh? f?ze</w:t>
+        <w:t>Legendary Actions - pouze druhá fáze</w:t>
       </w:r>
     </w:p>
     <w:p>
@@ -1639,7 +1704,7 @@
           <w:color w:val="2D1F15"/>
           <w:sz w:val="23"/>
         </w:rPr>
-        <w:t>Azandog m? 2 legendary actions za kolo. M??e je pou??t na konci tahu jin? bytosti. Na za??tku sv?ho tahu si je obnov?.</w:t>
+        <w:t>Azandog má 2 legendary actions za kolo. Může je použít na konci tahu jiné bytosti. Na začátku svého tahu si je obnoví.</w:t>
       </w:r>
     </w:p>
     <w:p>
@@ -1657,7 +1722,7 @@
           <w:color w:val="5C3114"/>
           <w:sz w:val="27"/>
         </w:rPr>
-        <w:t>Krok nen?visti</w:t>
+        <w:t>Krok nenávisti</w:t>
       </w:r>
     </w:p>
     <w:p>
@@ -1672,7 +1737,7 @@
           <w:color w:val="2D1F15"/>
           <w:sz w:val="23"/>
         </w:rPr>
-        <w:t>Azandog se pohne a? o polovinu sv? rychlosti bez vyvol?n? opportunity attacks.</w:t>
+        <w:t>Azandog se pohne až o polovinu své rychlosti bez vyvolání opportunity attacks.</w:t>
       </w:r>
     </w:p>
     <w:p>
@@ -1690,7 +1755,7 @@
           <w:color w:val="5C3114"/>
           <w:sz w:val="27"/>
         </w:rPr>
-        <w:t>?der tridentem</w:t>
+        <w:t>Úder tridentem</w:t>
       </w:r>
     </w:p>
     <w:p>
@@ -1705,7 +1770,7 @@
           <w:color w:val="2D1F15"/>
           <w:sz w:val="23"/>
         </w:rPr>
-        <w:t>Azandog provede jeden ?tok tridentem, ale bez extra psychic damage ze schopnosti Bodnut? z??t?.</w:t>
+        <w:t>Azandog provede jeden útok tridentem, ale bez extra psychic damage ze schopnosti Bodnutí zášti.</w:t>
       </w:r>
     </w:p>
     <w:p>
@@ -1723,7 +1788,7 @@
           <w:color w:val="5C3114"/>
           <w:sz w:val="27"/>
         </w:rPr>
-        <w:t>V?buch z??ti</w:t>
+        <w:t>Výbuch zášti</w:t>
       </w:r>
     </w:p>
     <w:p>
@@ -1738,7 +1803,7 @@
           <w:color w:val="2D1F15"/>
           <w:sz w:val="23"/>
         </w:rPr>
-        <w:t>Stoj? 2 legendary actions.</w:t>
+        <w:t>Stojí 2 legendary actions.</w:t>
       </w:r>
     </w:p>
     <w:p>
@@ -1753,7 +1818,7 @@
           <w:color w:val="2D1F15"/>
           <w:sz w:val="23"/>
         </w:rPr>
-        <w:t>Jedna bytost do 30 ft., kterou Azandog vid? a kter? ho od za??tku sv?ho minul?ho tahu zranila, mus? hodit DC 15 Wisdom saving throw.</w:t>
+        <w:t>Jedna bytost do 30 ft., kterou Azandog vidí a která ho od začátku svého minulého tahu zranila, musí hodit DC 15 Wisdom saving throw.</w:t>
       </w:r>
     </w:p>
     <w:p>
@@ -1768,7 +1833,7 @@
           <w:color w:val="2D1F15"/>
           <w:sz w:val="23"/>
         </w:rPr>
-        <w:t>P?i ne?sp?chu utrp? 2d8 psychic damage a m? nev?hodu na sv?j dal?? ?tok proti Azandogovi.</w:t>
+        <w:t>Při neúspěchu utrpí 2d8 psychic damage a má nevýhodu na svůj další útok proti Azandogovi.</w:t>
       </w:r>
     </w:p>
     <w:p>
@@ -1783,7 +1848,7 @@
           <w:color w:val="2D1F15"/>
           <w:sz w:val="23"/>
         </w:rPr>
-        <w:t>P?i ?sp?chu utrp? polovinu zran?n? a nev?hodu nedostane.</w:t>
+        <w:t>Při úspěchu utrpí polovinu zranění a nevýhodu nedostane.</w:t>
       </w:r>
     </w:p>
     <w:p>
@@ -1801,7 +1866,7 @@
           <w:color w:val="5C3114"/>
           <w:sz w:val="32"/>
         </w:rPr>
-        <w:t>Mechanika kl??e</w:t>
+        <w:t>Mechanika klíče</w:t>
       </w:r>
     </w:p>
     <w:p>
@@ -1819,7 +1884,7 @@
           <w:color w:val="5C3114"/>
           <w:sz w:val="27"/>
         </w:rPr>
-        <w:t>Kl?? ho dr?? na?ivu</w:t>
+        <w:t>Klíč ho drží naživu</w:t>
       </w:r>
     </w:p>
     <w:p>
@@ -1834,7 +1899,7 @@
           <w:color w:val="2D1F15"/>
           <w:sz w:val="23"/>
         </w:rPr>
-        <w:t>Dokud je Kl?? z??ti spojen? s Azandogem, Azandog nem??e b?t v prvn? f?zi trvale zabit.</w:t>
+        <w:t>Dokud je Klíč zášti spojený s Azandogem, Azandog nemůže být v první fázi trvale zabit.</w:t>
       </w:r>
     </w:p>
     <w:p>
@@ -1849,7 +1914,7 @@
           <w:color w:val="2D1F15"/>
           <w:sz w:val="23"/>
         </w:rPr>
-        <w:t>Kdy? klesne na 0 HP v prvn? f?zi, kl?? se aktivuje.</w:t>
+        <w:t>Když klesne na 0 HP v první fázi, klíč se aktivuje.</w:t>
       </w:r>
     </w:p>
     <w:p>
@@ -1864,7 +1929,7 @@
           <w:color w:val="2D1F15"/>
           <w:sz w:val="23"/>
         </w:rPr>
-        <w:t>T?m za?ne jeho p?em?na v ni???ho boha hn?vu a z??t?.</w:t>
+        <w:t>Tím začne jeho přeměna v nižšího boha hněvu a zášti.</w:t>
       </w:r>
     </w:p>
     <w:p>
@@ -1879,7 +1944,7 @@
           <w:color w:val="2D1F15"/>
           <w:sz w:val="23"/>
         </w:rPr>
-        <w:t>Hr??i si m??ou myslet, ?e ho porazili - ale ve skute?nosti pr?v? probudili artefakt.</w:t>
+        <w:t>Hráči si můžou myslet, že ho porazili - ale ve skutečnosti právě probudili artefakt.</w:t>
       </w:r>
     </w:p>
     <w:p>
@@ -1897,7 +1962,7 @@
           <w:color w:val="5C3114"/>
           <w:sz w:val="32"/>
         </w:rPr>
-        <w:t>Jak lze kl?? z?skat</w:t>
+        <w:t>Jak lze klíč získat</w:t>
       </w:r>
     </w:p>
     <w:p>
@@ -1915,7 +1980,7 @@
           <w:color w:val="5C3114"/>
           <w:sz w:val="27"/>
         </w:rPr>
-        <w:t>1. Porazit ob? f?ze</w:t>
+        <w:t>1. Porazit obě fáze</w:t>
       </w:r>
     </w:p>
     <w:p>
@@ -1930,7 +1995,7 @@
           <w:color w:val="2D1F15"/>
           <w:sz w:val="23"/>
         </w:rPr>
-        <w:t>Nejjednodu??? ?e?en?. Hr??i Azandoga poraz? v prvn? f?zi, p?e?ij? jeho bo?skou p?em?nu a pak poraz? i druhou f?zi. Po jeho zhroucen? mohou kl?? vz?t.</w:t>
+        <w:t>Nejjednodušší řešení. Hráči Azandoga porazí v první fázi, přežijí jeho božskou přeměnu a pak porazí i druhou fázi. Po jeho zhroucení mohou klíč vzít.</w:t>
       </w:r>
     </w:p>
     <w:p>
@@ -1948,7 +2013,7 @@
           <w:color w:val="5C3114"/>
           <w:sz w:val="27"/>
         </w:rPr>
-        <w:t>2. Vytrhnout kl?? b?hem boje</w:t>
+        <w:t>2. Vytrhnout klíč během boje</w:t>
       </w:r>
     </w:p>
     <w:p>
@@ -1963,7 +2028,7 @@
           <w:color w:val="2D1F15"/>
           <w:sz w:val="23"/>
         </w:rPr>
-        <w:t>Tohle je riskantn?j??, ale cool. Kl?? je mo?n? vyt?hnout, kdy? je Azandog oslaben?.</w:t>
+        <w:t>Tohle je riskantnější, ale cool. Klíč je možné vytáhnout, když je Azandog oslabený.</w:t>
       </w:r>
     </w:p>
     <w:p>
@@ -1978,7 +2043,7 @@
           <w:color w:val="2D1F15"/>
           <w:sz w:val="23"/>
         </w:rPr>
-        <w:t>Kl?? je odkryt?, pokud plat? alespo? jedna z t?chto v?c?:</w:t>
+        <w:t>Klíč je odkrytý, pokud platí alespoň jedna z těchto věcí:</w:t>
       </w:r>
     </w:p>
     <w:p>
@@ -1995,7 +2060,7 @@
           <w:color w:val="2D1F15"/>
           <w:sz w:val="23"/>
         </w:rPr>
-        <w:t>Azandog m? m?n? ne? polovinu HP.</w:t>
+        <w:t>Azandog má méně než polovinu HP.</w:t>
       </w:r>
     </w:p>
     <w:p>
@@ -2012,7 +2077,7 @@
           <w:color w:val="2D1F15"/>
           <w:sz w:val="23"/>
         </w:rPr>
-        <w:t>Azandog byl pr?v? zasa?en v?buchem plynov? kapsle.</w:t>
+        <w:t>Azandog byl právě zasažen výbuchem plynové kapsle.</w:t>
       </w:r>
     </w:p>
     <w:p>
@@ -2029,7 +2094,7 @@
           <w:color w:val="2D1F15"/>
           <w:sz w:val="23"/>
         </w:rPr>
-        <w:t>Azandog je prone, stunned nebo jinak v?razn? vyveden? z rovnov?hy.</w:t>
+        <w:t>Azandog je prone, stunned nebo jinak výrazně vyvedený z rovnováhy.</w:t>
       </w:r>
     </w:p>
     <w:p>
@@ -2046,7 +2111,7 @@
           <w:color w:val="2D1F15"/>
           <w:sz w:val="23"/>
         </w:rPr>
-        <w:t>Hr??i p?edt?m zjistili, ?e kl?? je zdroj jeho nesmrtelnosti.</w:t>
+        <w:t>Hráči předtím zjistili, že klíč je zdroj jeho nesmrtelnosti.</w:t>
       </w:r>
     </w:p>
     <w:p>
@@ -2061,7 +2126,7 @@
           <w:color w:val="2D1F15"/>
           <w:sz w:val="23"/>
         </w:rPr>
-        <w:t>Postava stoj?c? do 5 ft. od Azandoga m??e pou??t akci a pokusit se kl?? uvolnit.</w:t>
+        <w:t>Postava stojící do 5 ft. od Azandoga může použít akci a pokusit se klíč uvolnit.</w:t>
       </w:r>
     </w:p>
     <w:p>
@@ -2086,7 +2151,7 @@
           <w:color w:val="2D1F15"/>
           <w:sz w:val="23"/>
         </w:rPr>
-        <w:t>DC 15 Strength / Athletics - vyrvat ho silou; DC 15 Dexterity / Sleight of Hand - vytrhnout ho p?esn?; DC 15 Intelligence / Arcana nebo Religion - naru?it magickou vazbu.</w:t>
+        <w:t>DC 15 Strength / Athletics - vyrvat ho silou; DC 15 Dexterity / Sleight of Hand - vytrhnout ho přesně; DC 15 Intelligence / Arcana nebo Religion - narušit magickou vazbu.</w:t>
       </w:r>
     </w:p>
     <w:p>
@@ -2101,7 +2166,7 @@
           <w:color w:val="2D1F15"/>
           <w:sz w:val="23"/>
         </w:rPr>
-        <w:t>Pot?ebuj? celkem 3 ?sp?chy d??v ne? 2 ne?sp?chy.</w:t>
+        <w:t>Potřebují celkem 3 úspěchy dřív než 2 neúspěchy.</w:t>
       </w:r>
     </w:p>
     <w:p>
@@ -2116,7 +2181,7 @@
           <w:color w:val="2D1F15"/>
           <w:sz w:val="23"/>
         </w:rPr>
-        <w:t>P?i ka?d?m ne?sp?chu postava dostane 2d6 necrotic damage, proto?e kl?? ji pop?l? mrtvou magi?.</w:t>
+        <w:t>Při každém neúspěchu postava dostane 2d6 necrotic damage, protože klíč ji popálí mrtvou magií.</w:t>
       </w:r>
     </w:p>
     <w:p>
@@ -2131,7 +2196,7 @@
           <w:color w:val="2D1F15"/>
           <w:sz w:val="23"/>
         </w:rPr>
-        <w:t>Pokud usp?j?, kl?? je vytr?en a Azandog za?ne kolabovat.</w:t>
+        <w:t>Pokud uspějí, klíč je vytržen a Azandog začne kolabovat.</w:t>
       </w:r>
     </w:p>
     <w:p>
@@ -2149,7 +2214,7 @@
           <w:color w:val="5C3114"/>
           <w:sz w:val="27"/>
         </w:rPr>
-        <w:t>3. Oslabit ho plynov?mi kapslemi a ut?ct</w:t>
+        <w:t>3. Oslabit ho plynovými kapslemi a utéct</w:t>
       </w:r>
     </w:p>
     <w:p>
@@ -2164,7 +2229,7 @@
           <w:color w:val="2D1F15"/>
           <w:sz w:val="23"/>
         </w:rPr>
-        <w:t>Tohle je nejlep?? varianta, pokud chce?, aby hr??i pochopili: "Nemus?me ho zab?t. Sta?? z?skat kl?? a p?e??t."</w:t>
+        <w:t>Tohle je nejlepší varianta, pokud chceš, aby hráči pochopili: "Nemusíme ho zabít. Stačí získat klíč a přežít."</w:t>
       </w:r>
     </w:p>
     <w:p>
@@ -2179,7 +2244,7 @@
           <w:color w:val="2D1F15"/>
           <w:sz w:val="23"/>
         </w:rPr>
-        <w:t>Pokud hr??i odp?l? plynov? kapsle dob?e, m??ou Azandoga:</w:t>
+        <w:t>Pokud hráči odpálí plynové kapsle dobře, můžou Azandoga:</w:t>
       </w:r>
     </w:p>
     <w:p>
@@ -2230,7 +2295,7 @@
           <w:color w:val="2D1F15"/>
           <w:sz w:val="23"/>
         </w:rPr>
-        <w:t>oslepit kou?em</w:t>
+        <w:t>oslepit kouřem</w:t>
       </w:r>
     </w:p>
     <w:p>
@@ -2247,7 +2312,7 @@
           <w:color w:val="2D1F15"/>
           <w:sz w:val="23"/>
         </w:rPr>
-        <w:t>odd?lit od kl??e</w:t>
+        <w:t>oddělit od klíče</w:t>
       </w:r>
     </w:p>
     <w:p>
@@ -2264,7 +2329,7 @@
           <w:color w:val="2D1F15"/>
           <w:sz w:val="23"/>
         </w:rPr>
-        <w:t>nebo si vytvo?it ?anci k ?t?ku</w:t>
+        <w:t>nebo si vytvořit šanci k útěku</w:t>
       </w:r>
     </w:p>
     <w:p>
@@ -2282,7 +2347,7 @@
           <w:color w:val="5C3114"/>
           <w:sz w:val="32"/>
         </w:rPr>
-        <w:t>Ar?na s plynov?mi kapslemi</w:t>
+        <w:t>Aréna s plynovými kapslemi</w:t>
       </w:r>
     </w:p>
     <w:p>
@@ -2297,7 +2362,7 @@
           <w:color w:val="2D1F15"/>
           <w:sz w:val="23"/>
         </w:rPr>
-        <w:t>Ar?na m??e b?t star? d?ln? nebo tr?nn? m?stnost, kde jsou zabudovan? rezav? plynov? z?sobn?ky. T?eba poz?statek star?ho m?sta, t??by nebo obrann?ho syst?mu.</w:t>
+        <w:t>Aréna může být stará důlní nebo trůnní místnost, kde jsou zabudované rezavé plynové zásobníky. Třeba pozůstatek starého města, těžby nebo obranného systému.</w:t>
       </w:r>
     </w:p>
     <w:p>
@@ -2312,7 +2377,7 @@
           <w:color w:val="2D1F15"/>
           <w:sz w:val="23"/>
         </w:rPr>
-        <w:t>Doporu?en?: dej do ar?ny 4 plynov? kapsle. Ka?d? je viditeln?, ale ne ?pln? o?ividn? bezpe?n?. Hr??i by m?li m?t mo?nost je vyu??t, ale mus? jim doj?t, co d?laj?.</w:t>
+        <w:t>Doporučení: dej do arény 4 plynové kapsle. Každá je viditelná, ale ne úplně očividně bezpečná. Hráči by měli mít možnost je využít, ale musí jim dojít, co dělají.</w:t>
       </w:r>
     </w:p>
     <w:p>
@@ -2330,7 +2395,7 @@
           <w:color w:val="5C3114"/>
           <w:sz w:val="32"/>
         </w:rPr>
-        <w:t>Plynov? kapsle</w:t>
+        <w:t>Plynové kapsle</w:t>
       </w:r>
     </w:p>
     <w:p>
@@ -2460,7 +2525,7 @@
           <w:color w:val="2D1F15"/>
           <w:sz w:val="23"/>
         </w:rPr>
-        <w:t>Kapsli lze po?kodit ?tokem, kouzlem nebo fyzickou manipulac?.</w:t>
+        <w:t>Kapsli lze poškodit útokem, kouzlem nebo fyzickou manipulací.</w:t>
       </w:r>
     </w:p>
     <w:p>
@@ -2478,7 +2543,7 @@
           <w:color w:val="5C3114"/>
           <w:sz w:val="32"/>
         </w:rPr>
-        <w:t>Mo?nosti pou?it? kapsle</w:t>
+        <w:t>Možnosti použití kapsle</w:t>
       </w:r>
     </w:p>
     <w:p>
@@ -2496,7 +2561,7 @@
           <w:color w:val="5C3114"/>
           <w:sz w:val="27"/>
         </w:rPr>
-        <w:t>1. Prost?elit / rozb?t kapsli</w:t>
+        <w:t>1. Prostřelit / rozbít kapsli</w:t>
       </w:r>
     </w:p>
     <w:p>
@@ -2511,7 +2576,7 @@
           <w:color w:val="2D1F15"/>
           <w:sz w:val="23"/>
         </w:rPr>
-        <w:t>Kdy? n?kdo zas?hne kapsli ?tokem nebo kouzlem, za?ne z n? unikat plyn.</w:t>
+        <w:t>Když někdo zasáhne kapsli útokem nebo kouzlem, začne z ní unikat plyn.</w:t>
       </w:r>
     </w:p>
     <w:p>
@@ -2526,7 +2591,7 @@
           <w:color w:val="2D1F15"/>
           <w:sz w:val="23"/>
         </w:rPr>
-        <w:t>Vznikne oblak plynu v okruhu 10 ft. kolem kapsle. Oblak vydr?? do konce dal??ho kola.</w:t>
+        <w:t>Vznikne oblak plynu v okruhu 10 ft. kolem kapsle. Oblak vydrží do konce dalšího kola.</w:t>
       </w:r>
     </w:p>
     <w:p>
@@ -2575,7 +2640,7 @@
           <w:color w:val="2D1F15"/>
           <w:sz w:val="23"/>
         </w:rPr>
-        <w:t>t??ko se v n? d?ch?</w:t>
+        <w:t>těžko se v něm dýchá</w:t>
       </w:r>
     </w:p>
     <w:p>
@@ -2592,7 +2657,7 @@
           <w:color w:val="2D1F15"/>
           <w:sz w:val="23"/>
         </w:rPr>
-        <w:t>bytosti uvnit? maj? nev?hodu na Perception checky zalo?en? na zraku</w:t>
+        <w:t>bytosti uvnitř mají nevýhodu na Perception checky založené na zraku</w:t>
       </w:r>
     </w:p>
     <w:p>
@@ -2607,7 +2672,7 @@
           <w:color w:val="2D1F15"/>
           <w:sz w:val="23"/>
         </w:rPr>
-        <w:t>?iv? bytost, kter? za?ne sv?j tah v oblaku, mus? hodit DC 13 Constitution saving throw.</w:t>
+        <w:t>Živá bytost, která začne svůj tah v oblaku, musí hodit DC 13 Constitution saving throw.</w:t>
       </w:r>
     </w:p>
     <w:p>
@@ -2622,7 +2687,7 @@
           <w:color w:val="2D1F15"/>
           <w:sz w:val="23"/>
         </w:rPr>
-        <w:t>P?i ne?sp?chu dostane 1d6 poison damage a nem??e prov?d?t reactions do za??tku sv?ho dal??ho tahu.</w:t>
+        <w:t>Při neúspěchu dostane 1d6 poison damage a nemůže provádět reactions do začátku svého dalšího tahu.</w:t>
       </w:r>
     </w:p>
     <w:p>
@@ -2637,7 +2702,7 @@
           <w:color w:val="2D1F15"/>
           <w:sz w:val="23"/>
         </w:rPr>
-        <w:t>Nemrtv? nejsou jedem tolik ohro?en?, tak?e Azandog nedost?v? poison damage, ale st?le m??e b?t oblakem omezen? v?hledov?.</w:t>
+        <w:t>Nemrtví nejsou jedem tolik ohrožení, takže Azandog nedostává poison damage, ale stále může být oblakem omezený výhledově.</w:t>
       </w:r>
     </w:p>
     <w:p>
@@ -2655,7 +2720,7 @@
           <w:color w:val="5C3114"/>
           <w:sz w:val="27"/>
         </w:rPr>
-        <w:t>2. Zap?lit unikaj?c? plyn</w:t>
+        <w:t>2. Zapálit unikající plyn</w:t>
       </w:r>
     </w:p>
     <w:p>
@@ -2670,7 +2735,7 @@
           <w:color w:val="2D1F15"/>
           <w:sz w:val="23"/>
         </w:rPr>
-        <w:t>Pokud do plynov?ho oblaku zas?hne ohe?, kapsle exploduje.</w:t>
+        <w:t>Pokud do plynového oblaku zasáhne oheň, kapsle exploduje.</w:t>
       </w:r>
     </w:p>
     <w:p>
@@ -2685,7 +2750,7 @@
           <w:color w:val="2D1F15"/>
           <w:sz w:val="23"/>
         </w:rPr>
-        <w:t>Nap??klad:</w:t>
+        <w:t>Například:</w:t>
       </w:r>
     </w:p>
     <w:p>
@@ -2736,7 +2801,7 @@
           <w:color w:val="2D1F15"/>
           <w:sz w:val="23"/>
         </w:rPr>
-        <w:t>pochode?</w:t>
+        <w:t>pochodeň</w:t>
       </w:r>
     </w:p>
     <w:p>
@@ -2753,7 +2818,7 @@
           <w:color w:val="2D1F15"/>
           <w:sz w:val="23"/>
         </w:rPr>
-        <w:t>alchemist?s fire</w:t>
+        <w:t>alchemist's fire</w:t>
       </w:r>
     </w:p>
     <w:p>
@@ -2770,7 +2835,7 @@
           <w:color w:val="2D1F15"/>
           <w:sz w:val="23"/>
         </w:rPr>
-        <w:t>ohniv? ??p</w:t>
+        <w:t>ohnivý šíp</w:t>
       </w:r>
     </w:p>
     <w:p>
@@ -2787,7 +2852,7 @@
           <w:color w:val="2D1F15"/>
           <w:sz w:val="23"/>
         </w:rPr>
-        <w:t>zap?len? p?edm?t hozen? do oblaku</w:t>
+        <w:t>zapálený předmět hozený do oblaku</w:t>
       </w:r>
     </w:p>
     <w:p>
@@ -2805,7 +2870,7 @@
           <w:color w:val="5C3114"/>
           <w:sz w:val="27"/>
         </w:rPr>
-        <w:t>V?buch</w:t>
+        <w:t>Výbuch</w:t>
       </w:r>
     </w:p>
     <w:p>
@@ -2845,7 +2910,7 @@
           <w:color w:val="2D1F15"/>
           <w:sz w:val="23"/>
         </w:rPr>
-        <w:t>Ka?d? bytost v oblasti mus? hodit DC 14 Dexterity saving throw.</w:t>
+        <w:t>Každá bytost v oblasti musí hodit DC 14 Dexterity saving throw.</w:t>
       </w:r>
     </w:p>
     <w:p>
@@ -2862,7 +2927,7 @@
           <w:color w:val="2D1F15"/>
           <w:sz w:val="23"/>
         </w:rPr>
-        <w:t>P?i ne?sp?chu dostane 3d6 fire damage + 2d6 thunder damage.</w:t>
+        <w:t>Při neúspěchu dostane 3d6 fire damage + 2d6 thunder damage.</w:t>
       </w:r>
     </w:p>
     <w:p>
@@ -2879,7 +2944,7 @@
           <w:color w:val="2D1F15"/>
           <w:sz w:val="23"/>
         </w:rPr>
-        <w:t>P?i ?sp?chu dostane polovinu.</w:t>
+        <w:t>Při úspěchu dostane polovinu.</w:t>
       </w:r>
     </w:p>
     <w:p>
@@ -2897,7 +2962,7 @@
           <w:color w:val="5C3114"/>
           <w:sz w:val="32"/>
         </w:rPr>
-        <w:t>Speci?ln? efekt na Azandoga</w:t>
+        <w:t>Speciální efekt na Azandoga</w:t>
       </w:r>
     </w:p>
     <w:p>
@@ -2912,7 +2977,7 @@
           <w:color w:val="2D1F15"/>
           <w:sz w:val="23"/>
         </w:rPr>
-        <w:t>Kdy? je Azandog zasa?en v?buchem plynov? kapsle, neutrp? jen zran?n?. Nav?c se stane toto:</w:t>
+        <w:t>Když je Azandog zasažen výbuchem plynové kapsle, neutrpí jen zranění. Navíc se stane toto:</w:t>
       </w:r>
     </w:p>
     <w:p>
@@ -2929,7 +2994,7 @@
           <w:color w:val="2D1F15"/>
           <w:sz w:val="23"/>
         </w:rPr>
-        <w:t>Azandog je sra?en prone, pokud neusp?je na DC 14 Strength saving throw.</w:t>
+        <w:t>Azandog je sražen prone, pokud neuspěje na DC 14 Strength saving throw.</w:t>
       </w:r>
     </w:p>
     <w:p>
@@ -2946,7 +3011,7 @@
           <w:color w:val="2D1F15"/>
           <w:sz w:val="23"/>
         </w:rPr>
-        <w:t>Do za??tku sv?ho dal??ho tahu nem??e pou??vat reactions.</w:t>
+        <w:t>Do začátku svého dalšího tahu nemůže používat reactions.</w:t>
       </w:r>
     </w:p>
     <w:p>
@@ -2963,7 +3028,7 @@
           <w:color w:val="2D1F15"/>
           <w:sz w:val="23"/>
         </w:rPr>
-        <w:t>Kl?? v jeho hrudi se na 1 kolo odkryje a je mo?n? se ho pokusit vytrhnout.</w:t>
+        <w:t>Klíč v jeho hrudi se na 1 kolo odkryje a je možné se ho pokusit vytrhnout.</w:t>
       </w:r>
     </w:p>
     <w:p>
@@ -2980,7 +3045,7 @@
           <w:color w:val="2D1F15"/>
           <w:sz w:val="23"/>
         </w:rPr>
-        <w:t>Ve druh? f?zi ztr?c? jednu svoji legendary action v dal??m kole.</w:t>
+        <w:t>Ve druhé fázi ztrácí jednu svoji legendary action v dalším kole.</w:t>
       </w:r>
     </w:p>
     <w:p>
@@ -2995,7 +3060,7 @@
           <w:color w:val="2D1F15"/>
           <w:sz w:val="23"/>
         </w:rPr>
-        <w:t>Tohle je d?le?it?, proto?e kapsle hr???m d?vaj? skute?nou taktickou v?hodu.</w:t>
+        <w:t>Tohle je důležité, protože kapsle hráčům dávají skutečnou taktickou výhodu.</w:t>
       </w:r>
     </w:p>
     <w:sectPr>
@@ -3008,7 +3073,70 @@
 </w:document>
 </file>
 
-<file path=word/numbering.xml><?xml version="1.0" encoding="utf-8"?>
+<file path=word\fontTable.xml><?xml version="1.0" encoding="utf-8"?>
+<w:fonts xmlns:mc="http://schemas.openxmlformats.org/markup-compatibility/2006" xmlns:r="http://schemas.openxmlformats.org/officeDocument/2006/relationships" xmlns:w="http://schemas.openxmlformats.org/wordprocessingml/2006/main" xmlns:w14="http://schemas.microsoft.com/office/word/2010/wordml" mc:Ignorable="w14">
+  <w:font w:name="Symbol">
+    <w:panose1 w:val="00000000000000000000"/>
+    <w:charset w:val="02"/>
+    <w:family w:val="auto"/>
+    <w:pitch w:val="variable"/>
+    <w:sig w:usb0="00000000" w:usb1="10000000" w:usb2="00000000" w:usb3="00000000" w:csb0="80000000" w:csb1="00000000"/>
+  </w:font>
+  <w:font w:name="Times New Roman">
+    <w:panose1 w:val="02020603050405020304"/>
+    <w:charset w:val="00"/>
+    <w:family w:val="auto"/>
+    <w:pitch w:val="variable"/>
+    <w:sig w:usb0="E0002AFF" w:usb1="C0007841" w:usb2="00000009" w:usb3="00000000" w:csb0="000001FF" w:csb1="00000000"/>
+  </w:font>
+  <w:font w:name="Cambria">
+    <w:panose1 w:val="02040503050406030204"/>
+    <w:charset w:val="00"/>
+    <w:family w:val="auto"/>
+    <w:pitch w:val="variable"/>
+    <w:sig w:usb0="E00002FF" w:usb1="400004FF" w:usb2="00000000" w:usb3="00000000" w:csb0="0000019F" w:csb1="00000000"/>
+  </w:font>
+  <w:font w:name="ＭＳ 明朝">
+    <w:panose1 w:val="00000000000000000000"/>
+    <w:charset w:val="80"/>
+    <w:family w:val="roman"/>
+    <w:notTrueType/>
+    <w:pitch w:val="fixed"/>
+    <w:sig w:usb0="00000001" w:usb1="08070000" w:usb2="00000010" w:usb3="00000000" w:csb0="00020000" w:csb1="00000000"/>
+  </w:font>
+  <w:font w:name="Calibri">
+    <w:panose1 w:val="020F0502020204030204"/>
+    <w:charset w:val="00"/>
+    <w:family w:val="auto"/>
+    <w:pitch w:val="variable"/>
+    <w:sig w:usb0="E10002FF" w:usb1="4000ACFF" w:usb2="00000009" w:usb3="00000000" w:csb0="0000019F" w:csb1="00000000"/>
+  </w:font>
+  <w:font w:name="ＭＳ ゴシック">
+    <w:panose1 w:val="00000000000000000000"/>
+    <w:charset w:val="80"/>
+    <w:family w:val="modern"/>
+    <w:notTrueType/>
+    <w:pitch w:val="fixed"/>
+    <w:sig w:usb0="00000001" w:usb1="08070000" w:usb2="00000010" w:usb3="00000000" w:csb0="00020000" w:csb1="00000000"/>
+  </w:font>
+  <w:font w:name="Courier">
+    <w:panose1 w:val="02000500000000000000"/>
+    <w:charset w:val="00"/>
+    <w:family w:val="auto"/>
+    <w:pitch w:val="variable"/>
+    <w:sig w:usb0="00000003" w:usb1="00000000" w:usb2="00000000" w:usb3="00000000" w:csb0="00000001" w:csb1="00000000"/>
+  </w:font>
+  <w:font w:name="Arial">
+    <w:panose1 w:val="020B0604020202020204"/>
+    <w:charset w:val="00"/>
+    <w:family w:val="auto"/>
+    <w:pitch w:val="variable"/>
+    <w:sig w:usb0="E0002AFF" w:usb1="C0007843" w:usb2="00000009" w:usb3="00000000" w:csb0="000001FF" w:csb1="00000000"/>
+  </w:font>
+</w:fonts>
+</file>
+
+<file path=word\numbering.xml><?xml version="1.0" encoding="utf-8"?>
 <w:numbering xmlns:wpc="http://schemas.microsoft.com/office/word/2010/wordprocessingCanvas" xmlns:mo="http://schemas.microsoft.com/office/mac/office/2008/main" xmlns:mc="http://schemas.openxmlformats.org/markup-compatibility/2006" xmlns:mv="urn:schemas-microsoft-com:mac:vml" xmlns:o="urn:schemas-microsoft-com:office:office" xmlns:r="http://schemas.openxmlformats.org/officeDocument/2006/relationships" xmlns:m="http://schemas.openxmlformats.org/officeDocument/2006/math" xmlns:v="urn:schemas-microsoft-com:vml" xmlns:wp14="http://schemas.microsoft.com/office/word/2010/wordprocessingDrawing" xmlns:wp="http://schemas.openxmlformats.org/drawingml/2006/wordprocessingDrawing" xmlns:w10="urn:schemas-microsoft-com:office:word" xmlns:w="http://schemas.openxmlformats.org/wordprocessingml/2006/main" xmlns:w14="http://schemas.microsoft.com/office/word/2010/wordml" xmlns:wpg="http://schemas.microsoft.com/office/word/2010/wordprocessingGroup" xmlns:wpi="http://schemas.microsoft.com/office/word/2010/wordprocessingInk" xmlns:wne="http://schemas.microsoft.com/office/word/2006/wordml" xmlns:wps="http://schemas.microsoft.com/office/word/2010/wordprocessingShape" mc:Ignorable="w14 wp14">
   <w:abstractNum w:abstractNumId="0">
     <w:nsid w:val="FFFFFF7C"/>
@@ -3211,7 +3339,62 @@
 </w:numbering>
 </file>
 
-<file path=word/styles.xml><?xml version="1.0" encoding="utf-8"?>
+<file path=word\settings.xml><?xml version="1.0" encoding="utf-8"?>
+<w:settings xmlns:mc="http://schemas.openxmlformats.org/markup-compatibility/2006" xmlns:o="urn:schemas-microsoft-com:office:office" xmlns:r="http://schemas.openxmlformats.org/officeDocument/2006/relationships" xmlns:m="http://schemas.openxmlformats.org/officeDocument/2006/math" xmlns:v="urn:schemas-microsoft-com:vml" xmlns:w10="urn:schemas-microsoft-com:office:word" xmlns:w="http://schemas.openxmlformats.org/wordprocessingml/2006/main" xmlns:w14="http://schemas.microsoft.com/office/word/2010/wordml" xmlns:sl="http://schemas.openxmlformats.org/schemaLibrary/2006/main" mc:Ignorable="w14">
+  <w:zoom w:val="bestFit"/>
+  <w:proofState w:spelling="clean" w:grammar="clean"/>
+  <w:defaultTabStop w:val="720"/>
+  <w:characterSpacingControl w:val="doNotCompress"/>
+  <w:savePreviewPicture/>
+  <w:compat>
+    <w:useFELayout/>
+    <w:compatSetting w:name="compatibilityMode" w:uri="http://schemas.microsoft.com/office/word" w:val="14"/>
+    <w:compatSetting w:name="overrideTableStyleFontSizeAndJustification" w:uri="http://schemas.microsoft.com/office/word" w:val="1"/>
+    <w:compatSetting w:name="enableOpenTypeFeatures" w:uri="http://schemas.microsoft.com/office/word" w:val="1"/>
+    <w:compatSetting w:name="doNotFlipMirrorIndents" w:uri="http://schemas.microsoft.com/office/word" w:val="1"/>
+  </w:compat>
+  <w:rsids>
+    <w:rsidRoot w:val="00B47730"/>
+    <w:rsid w:val="00034616"/>
+    <w:rsid w:val="0006063C"/>
+    <w:rsid w:val="0015074B"/>
+    <w:rsid w:val="0029639D"/>
+    <w:rsid w:val="00326F90"/>
+    <w:rsid w:val="00AA1D8D"/>
+    <w:rsid w:val="00B47730"/>
+    <w:rsid w:val="00CB0664"/>
+    <w:rsid w:val="00FC693F"/>
+  </w:rsids>
+  <m:mathPr>
+    <m:mathFont m:val="Cambria Math"/>
+    <m:brkBin m:val="before"/>
+    <m:brkBinSub m:val="--"/>
+    <m:smallFrac m:val="0"/>
+    <m:dispDef/>
+    <m:lMargin m:val="0"/>
+    <m:rMargin m:val="0"/>
+    <m:defJc m:val="centerGroup"/>
+    <m:wrapIndent m:val="1440"/>
+    <m:intLim m:val="subSup"/>
+    <m:naryLim m:val="undOvr"/>
+  </m:mathPr>
+  <w:themeFontLang w:val="en-US" w:eastAsia="ja-JP"/>
+  <w:clrSchemeMapping w:bg1="light1" w:t1="dark1" w:bg2="light2" w:t2="dark2" w:accent1="accent1" w:accent2="accent2" w:accent3="accent3" w:accent4="accent4" w:accent5="accent5" w:accent6="accent6" w:hyperlink="hyperlink" w:followedHyperlink="followedHyperlink"/>
+  <w:doNotAutoCompressPictures/>
+  <w:shapeDefaults>
+    <o:shapedefaults v:ext="edit" spidmax="1027"/>
+    <o:shapelayout v:ext="edit">
+      <o:idmap v:ext="edit" data="1"/>
+    </o:shapelayout>
+  </w:shapeDefaults>
+  <w:decimalSymbol w:val="."/>
+  <w:listSeparator w:val=","/>
+  <w14:docId w14:val="24062061"/>
+  <w14:defaultImageDpi w14:val="300"/>
+</w:settings>
+</file>
+
+<file path=word\styles.xml><?xml version="1.0" encoding="utf-8"?>
 <w:styles xmlns:mc="http://schemas.openxmlformats.org/markup-compatibility/2006" xmlns:r="http://schemas.openxmlformats.org/officeDocument/2006/relationships" xmlns:w="http://schemas.openxmlformats.org/wordprocessingml/2006/main" xmlns:w14="http://schemas.microsoft.com/office/word/2010/wordml" mc:Ignorable="w14">
   <w:docDefaults>
     <w:rPrDefault>
@@ -15062,7 +15245,7 @@
 </w:styles>
 </file>
 
-<file path=word/stylesWithEffects.xml><?xml version="1.0" encoding="utf-8"?>
+<file path=word\stylesWithEffects.xml><?xml version="1.0" encoding="utf-8"?>
 <w:styles xmlns:wpc="http://schemas.microsoft.com/office/word/2010/wordprocessingCanvas" xmlns:mo="http://schemas.microsoft.com/office/mac/office/2008/main" xmlns:mc="http://schemas.openxmlformats.org/markup-compatibility/2006" xmlns:mv="urn:schemas-microsoft-com:mac:vml" xmlns:o="urn:schemas-microsoft-com:office:office" xmlns:r="http://schemas.openxmlformats.org/officeDocument/2006/relationships" xmlns:m="http://schemas.openxmlformats.org/officeDocument/2006/math" xmlns:v="urn:schemas-microsoft-com:vml" xmlns:wp14="http://schemas.microsoft.com/office/word/2010/wordprocessingDrawing" xmlns:wp="http://schemas.openxmlformats.org/drawingml/2006/wordprocessingDrawing" xmlns:w10="urn:schemas-microsoft-com:office:word" xmlns:w="http://schemas.openxmlformats.org/wordprocessingml/2006/main" xmlns:w14="http://schemas.microsoft.com/office/word/2010/wordml" xmlns:wpg="http://schemas.microsoft.com/office/word/2010/wordprocessingGroup" xmlns:wpi="http://schemas.microsoft.com/office/word/2010/wordprocessingInk" xmlns:wne="http://schemas.microsoft.com/office/word/2006/wordml" xmlns:wps="http://schemas.microsoft.com/office/word/2010/wordprocessingShape" mc:Ignorable="w14 wp14">
   <w:docDefaults>
     <w:rPrDefault>
@@ -26864,7 +27047,7 @@
 </w:styles>
 </file>
 
-<file path=word/theme/theme1.xml><?xml version="1.0" encoding="utf-8"?>
+<file path=word\theme\theme1.xml><?xml version="1.0" encoding="utf-8"?>
 <a:theme xmlns:a="http://schemas.openxmlformats.org/drawingml/2006/main" name="Office Theme">
   <a:themeElements>
     <a:clrScheme name="Office">
@@ -27184,14 +27367,9 @@
 </a:theme>
 </file>
 
-<file path=customXml/item1.xml><?xml version="1.0" encoding="utf-8"?>
-<b:Sources xmlns:b="http://schemas.openxmlformats.org/officeDocument/2006/bibliography" xmlns="http://schemas.openxmlformats.org/officeDocument/2006/bibliography" SelectedStyle="/APA.XSL" StyleName="APA"/>
-</file>
-
-<file path=customXml/itemProps1.xml><?xml version="1.0" encoding="utf-8"?>
-<ds:datastoreItem xmlns:ds="http://schemas.openxmlformats.org/officeDocument/2006/customXml" ds:itemID="{EF278816-EC6F-A645-907D-7F25AECB1D4A}">
-  <ds:schemaRefs>
-    <ds:schemaRef ds:uri="http://schemas.openxmlformats.org/officeDocument/2006/bibliography"/>
-  </ds:schemaRefs>
-</ds:datastoreItem>
+<file path=word\webSettings.xml><?xml version="1.0" encoding="utf-8"?>
+<w:webSettings xmlns:mc="http://schemas.openxmlformats.org/markup-compatibility/2006" xmlns:r="http://schemas.openxmlformats.org/officeDocument/2006/relationships" xmlns:w="http://schemas.openxmlformats.org/wordprocessingml/2006/main" xmlns:w14="http://schemas.microsoft.com/office/word/2010/wordml" mc:Ignorable="w14">
+  <w:allowPNG/>
+  <w:doNotSaveAsSingleFile/>
+</w:webSettings>
 </file>
</xml_diff>